<commit_message>
fix: Docinho's and Garu's .docx
</commit_message>
<xml_diff>
--- a/curiosidades/docinho.docx
+++ b/curiosidades/docinho.docx
@@ -90,13 +90,16 @@
         <w:t xml:space="preserve"> e seu cabelo deveria </w:t>
       </w:r>
       <w:r>
-        <w:t xml:space="preserve">ser loiro, igual ao de </w:t>
-      </w:r>
-      <w:proofErr w:type="spellStart"/>
-      <w:r>
-        <w:t>Lidinha</w:t>
-      </w:r>
-      <w:proofErr w:type="spellEnd"/>
+        <w:t xml:space="preserve">ser loiro, igual ao </w:t>
+      </w:r>
+      <w:proofErr w:type="gramStart"/>
+      <w:r>
+        <w:t xml:space="preserve">de </w:t>
+      </w:r>
+      <w:r>
+        <w:t>Lindinha</w:t>
+      </w:r>
+      <w:proofErr w:type="gramEnd"/>
       <w:r>
         <w:t xml:space="preserve">, no entanto o visual acabou mudando, o criador </w:t>
       </w:r>
@@ -125,13 +128,25 @@
       <w:r>
         <w:t xml:space="preserve">é que seu nome também não seria Docinho, seria </w:t>
       </w:r>
+      <w:r>
+        <w:t>“</w:t>
+      </w:r>
       <w:proofErr w:type="spellStart"/>
       <w:r>
         <w:t>Bad</w:t>
       </w:r>
       <w:proofErr w:type="spellEnd"/>
       <w:r>
-        <w:t xml:space="preserve"> (que em inglês é ruim), </w:t>
+        <w:t>”</w:t>
+      </w:r>
+      <w:r>
+        <w:t xml:space="preserve"> (</w:t>
+      </w:r>
+      <w:r>
+        <w:t>ruim em inglês</w:t>
+      </w:r>
+      <w:r>
+        <w:t xml:space="preserve">), </w:t>
       </w:r>
       <w:r>
         <w:t>ou seja,</w:t>
@@ -176,11 +191,9 @@
       <w:r>
         <w:t xml:space="preserve">é a mais humana </w:t>
       </w:r>
-      <w:proofErr w:type="gramStart"/>
-      <w:r>
-        <w:t>das irmãos</w:t>
-      </w:r>
-      <w:proofErr w:type="gramEnd"/>
+      <w:r>
+        <w:t>das irmãs</w:t>
+      </w:r>
       <w:r>
         <w:t xml:space="preserve"> não tendo um poder especial, que seja além de sua força, inclusive ela até sabe enrolar a língua, algo que as irmãs não conseguem.</w:t>
       </w:r>
@@ -209,11 +222,9 @@
       <w:r>
         <w:t xml:space="preserve"> e </w:t>
       </w:r>
-      <w:proofErr w:type="gramStart"/>
-      <w:r>
-        <w:t>seu sentimentos</w:t>
-      </w:r>
-      <w:proofErr w:type="gramEnd"/>
+      <w:r>
+        <w:t>seus sentimentos</w:t>
+      </w:r>
       <w:r>
         <w:t xml:space="preserve"> por beijo, mesmo que negue até a morte a exist</w:t>
       </w:r>

</xml_diff>